<commit_message>
Bible v2.35: Full hybrid transcript pipeline + unified agent YAML documented
Replaced old 3-step transcript processing with complete 6-step pipeline:
- Step 1: Clean (filler removal)
- Step 2: Extractive pre-filter (TextRank via Sumy — 35% sentence retention)
- Step 3: Abstractive structured JSON (summary, key_points, action_items, tickers, relevance)
- Step 4: Sub-tags (12 retirement-specific patterns)
- Step 5: Cross-channel dedup (Jaccard n-gram fingerprints, 40% threshold)
- Step 6: Tiered purge (Q≥75 forever, Q50-74 12mo, Q<50 90d)

Updated sections:
- Retention: was "indefinite" → now tiered with automated purge
- Processing: was 3-step → now 6-step with full flow diagram
- Agent integration: shows exact format agents receive
- Unified agent config (agents_data_sources.yaml) documented
- Limitations: updated — cross-channel dedup now built (was listed as missing)

Co-Authored-By: Claude Opus 4.6 (1M context) <noreply@anthropic.com>
</commit_message>
<xml_diff>
--- a/reports/2026-04-29/0900/trade_ai_2026-04-29_0900.docx
+++ b/reports/2026-04-29/0900/trade_ai_2026-04-29_0900.docx
@@ -19,7 +19,7 @@
         <w:rPr>
           <w:sz w:val="20"/>
         </w:rPr>
-        <w:t>Run Window: 0900  ·  Date: 2026-04-29  ·  Generated: 09:38:24 ET</w:t>
+        <w:t>Run Window: 0900  ·  Date: 2026-04-29  ·  Generated: 10:05:44 ET</w:t>
       </w:r>
     </w:p>
     <w:p>
@@ -202,7 +202,7 @@
           </w:tcPr>
           <w:p>
             <w:r>
-              <w:t>15</w:t>
+              <w:t>17</w:t>
             </w:r>
           </w:p>
         </w:tc>
@@ -224,7 +224,7 @@
           </w:tcPr>
           <w:p>
             <w:r>
-              <w:t>4</w:t>
+              <w:t>5</w:t>
             </w:r>
           </w:p>
         </w:tc>
@@ -246,7 +246,7 @@
           </w:tcPr>
           <w:p>
             <w:r>
-              <w:t>9</w:t>
+              <w:t>8</w:t>
             </w:r>
           </w:p>
         </w:tc>
@@ -268,7 +268,7 @@
           </w:tcPr>
           <w:p>
             <w:r>
-              <w:t>5</w:t>
+              <w:t>0</w:t>
             </w:r>
           </w:p>
         </w:tc>
@@ -290,7 +290,7 @@
           </w:tcPr>
           <w:p>
             <w:r>
-              <w:t>19</w:t>
+              <w:t>22</w:t>
             </w:r>
           </w:p>
         </w:tc>
@@ -336,7 +336,7 @@
         <w:rPr>
           <w:sz w:val="19"/>
         </w:rPr>
-        <w:t>🆕 NEW  SAGT  —  Score: 50  ·  GO</w:t>
+        <w:t>📈 UP   SAGT  —  41 → 50 (+9)</w:t>
       </w:r>
     </w:p>
     <w:p>
@@ -347,7 +347,7 @@
         <w:rPr>
           <w:sz w:val="19"/>
         </w:rPr>
-        <w:t>📈 UP   FCEL  —  28 → 43 (+15)</w:t>
+        <w:t>🔥 CAT  SAGT  —  Earnings Scheduled For April 29, 2026</w:t>
       </w:r>
     </w:p>
     <w:p>
@@ -358,7 +358,7 @@
         <w:rPr>
           <w:sz w:val="19"/>
         </w:rPr>
-        <w:t xml:space="preserve">🔥 CAT  FCEL  —  Bloom Energy Hikes AI-Fueled Outlook Above Views After Huge Earnings Beat; Is FuelCell Energy, Inc. </w:t>
+        <w:t>🔥 CAT  FCEL  —  12 Industrials Stocks Moving In Wednesday's Pre-Market Session</w:t>
       </w:r>
     </w:p>
     <w:p>
@@ -369,7 +369,7 @@
         <w:rPr>
           <w:sz w:val="19"/>
         </w:rPr>
-        <w:t>✅ CRIT FCEL  —  has_high_impact</w:t>
+        <w:t>📈 UP   TRAW  —  28 → 43 (+15)</w:t>
       </w:r>
     </w:p>
     <w:p>
@@ -380,7 +380,18 @@
         <w:rPr>
           <w:sz w:val="19"/>
         </w:rPr>
-        <w:t>📈 UP   PRCH  —  35 → 42 (+7)</w:t>
+        <w:t>🔥 CAT  TRAW  —  12 Health Care Stocks Moving In Wednesday's Pre-Market Session</w:t>
+      </w:r>
+    </w:p>
+    <w:p>
+      <w:pPr>
+        <w:spacing w:after="20"/>
+      </w:pPr>
+      <w:r>
+        <w:rPr>
+          <w:sz w:val="19"/>
+        </w:rPr>
+        <w:t>✅ CRIT TRAW  —  has_fresh_catalyst, has_catalyst</w:t>
       </w:r>
     </w:p>
     <w:p>
@@ -402,7 +413,7 @@
         <w:rPr>
           <w:sz w:val="19"/>
         </w:rPr>
-        <w:t>🆕 NEW  FVRR  —  Score: 39  ·  WAIT</w:t>
+        <w:t>🔥 CAT  KALV  —  12 Health Care Stocks Moving In Wednesday's Pre-Market Session</w:t>
       </w:r>
     </w:p>
     <w:p>
@@ -413,7 +424,7 @@
         <w:rPr>
           <w:sz w:val="19"/>
         </w:rPr>
-        <w:t>🔥 CAT  SKYQ  —  Sky Quarry Issues Request for Proposals to Accelerate Development of One Hundred Eighty Million Barr</w:t>
+        <w:t>📉 DOWN FVRR  —  45 → 39 (-6)</w:t>
       </w:r>
     </w:p>
     <w:p>
@@ -424,7 +435,7 @@
         <w:rPr>
           <w:sz w:val="19"/>
         </w:rPr>
-        <w:t>✅ CRIT SKYQ  —  has_catalyst, has_fresh_catalyst</w:t>
+        <w:t>🔥 CAT  FVRR  —  12 Industrials Stocks Moving In Wednesday's Pre-Market Session; Earnings Scheduled For April 29, 202</w:t>
       </w:r>
     </w:p>
     <w:p>
@@ -435,7 +446,7 @@
         <w:rPr>
           <w:sz w:val="19"/>
         </w:rPr>
-        <w:t>📉 DOWN GCTK  —  39 → 33 (-6)</w:t>
+        <w:t>🔥 CAT  AGIO  —  Agios Pharmaceuticals (AGIO) Reports Q1 Loss, Tops Revenue Estimates; Earnings Scheduled For April 2</w:t>
       </w:r>
     </w:p>
     <w:p>
@@ -446,7 +457,7 @@
         <w:rPr>
           <w:sz w:val="19"/>
         </w:rPr>
-        <w:t>🔥 CAT  RDZN  —  Loss-Making Roadzen, Inc. (NASDAQ:RDZN) Expected To Breakeven In The Medium-Term; Roadzen’s drivebud</w:t>
+        <w:t>📉 DOWN AKAN  —  38 → 32 (-6)</w:t>
       </w:r>
     </w:p>
     <w:p>
@@ -457,7 +468,7 @@
         <w:rPr>
           <w:sz w:val="19"/>
         </w:rPr>
-        <w:t>✅ CRIT RDZN  —  change_above_10pct</w:t>
+        <w:t>🔥 CAT  AKAN  —  12 Health Care Stocks Moving In Wednesday's Pre-Market Session</w:t>
       </w:r>
     </w:p>
     <w:p>
@@ -468,7 +479,7 @@
         <w:rPr>
           <w:sz w:val="19"/>
         </w:rPr>
-        <w:t>📉 DOWN WALD  —  44 → 33 (-11)</w:t>
+        <w:t>📉 DOWN OPFI  —  37 → 32 (-5)</w:t>
       </w:r>
     </w:p>
     <w:p>
@@ -479,7 +490,7 @@
         <w:rPr>
           <w:sz w:val="19"/>
         </w:rPr>
-        <w:t>🆕 NEW  OPFI  —  Score: 32  ·  WAIT</w:t>
+        <w:t>🔥 CAT  OPFI  —  OppFi : acquires BNC Bank</w:t>
       </w:r>
     </w:p>
     <w:p>
@@ -490,7 +501,7 @@
         <w:rPr>
           <w:sz w:val="19"/>
         </w:rPr>
-        <w:t>🔥 CAT  MNTS  —  Fully Booked Momentus Mission Advances Through Preliminary Design Review, Driving Toward 2027 Launch</w:t>
+        <w:t>📈 UP   CRBP  —  24 → 31 (+7)</w:t>
       </w:r>
     </w:p>
     <w:p>
@@ -501,7 +512,7 @@
         <w:rPr>
           <w:sz w:val="19"/>
         </w:rPr>
-        <w:t>🆕 NEW  PPSI  —  Score: 29  ·  AVOID</w:t>
+        <w:t>🔥 CAT  CRBP  —  Spotify upgraded, Alibaba initiated: Wall Street's top analyst calls</w:t>
       </w:r>
     </w:p>
     <w:p>
@@ -512,7 +523,7 @@
         <w:rPr>
           <w:sz w:val="19"/>
         </w:rPr>
-        <w:t>🆕 NEW  NBP  —  Score: 23  ·  AVOID</w:t>
+        <w:t>🚀 RVOL CRBP  —  Crossed 5.0x  (now 6.9x)</w:t>
       </w:r>
     </w:p>
     <w:p>
@@ -523,7 +534,7 @@
         <w:rPr>
           <w:sz w:val="19"/>
         </w:rPr>
-        <w:t>👻 FADE ATLN  —  Dropped out  (was 30)</w:t>
+        <w:t>✅ CRIT CRBP  —  rvol_above_5</w:t>
       </w:r>
     </w:p>
     <w:p>
@@ -534,7 +545,29 @@
         <w:rPr>
           <w:sz w:val="19"/>
         </w:rPr>
-        <w:t>👻 FADE VNRX  —  Dropped out  (was 26)</w:t>
+        <w:t>🚀 RVOL MAIA  —  Crossed 5.0x  (now 7.4x)</w:t>
+      </w:r>
+    </w:p>
+    <w:p>
+      <w:pPr>
+        <w:spacing w:after="20"/>
+      </w:pPr>
+      <w:r>
+        <w:rPr>
+          <w:sz w:val="19"/>
+        </w:rPr>
+        <w:t>✅ CRIT MAIA  —  rvol_above_5, change_above_10pct</w:t>
+      </w:r>
+    </w:p>
+    <w:p>
+      <w:pPr>
+        <w:spacing w:after="20"/>
+      </w:pPr>
+      <w:r>
+        <w:rPr>
+          <w:sz w:val="19"/>
+        </w:rPr>
+        <w:t>👻 FADE GCTK  —  Dropped out  (was 39)</w:t>
       </w:r>
     </w:p>
     <w:p>
@@ -794,7 +827,7 @@
               <w:rPr>
                 <w:sz w:val="17"/>
               </w:rPr>
-              <w:t>$2.89</w:t>
+              <w:t>$2.48</w:t>
             </w:r>
           </w:p>
         </w:tc>
@@ -807,7 +840,7 @@
               <w:rPr>
                 <w:sz w:val="17"/>
               </w:rPr>
-              <w:t>+70.0%</w:t>
+              <w:t>+45.9%</w:t>
             </w:r>
           </w:p>
         </w:tc>
@@ -928,7 +961,7 @@
               <w:rPr>
                 <w:sz w:val="17"/>
               </w:rPr>
-              <w:t>$11.19</w:t>
+              <w:t>$11.10</w:t>
             </w:r>
           </w:p>
         </w:tc>
@@ -941,7 +974,7 @@
               <w:rPr>
                 <w:sz w:val="17"/>
               </w:rPr>
-              <w:t>+12.6%</w:t>
+              <w:t>+11.7%</w:t>
             </w:r>
           </w:p>
         </w:tc>
@@ -981,6 +1014,140 @@
                 <w:sz w:val="17"/>
               </w:rPr>
               <w:t>Bloom Energy Hikes AI-Fueled Outlook Above Views A</w:t>
+            </w:r>
+          </w:p>
+        </w:tc>
+      </w:tr>
+      <w:tr>
+        <w:tc>
+          <w:tcPr>
+            <w:tcW w:type="dxa" w:w="1008"/>
+          </w:tcPr>
+          <w:p>
+            <w:r>
+              <w:rPr>
+                <w:sz w:val="17"/>
+              </w:rPr>
+              <w:t>TRAW</w:t>
+            </w:r>
+          </w:p>
+        </w:tc>
+        <w:tc>
+          <w:tcPr>
+            <w:tcW w:type="dxa" w:w="1008"/>
+          </w:tcPr>
+          <w:p>
+            <w:r>
+              <w:rPr>
+                <w:sz w:val="17"/>
+              </w:rPr>
+              <w:t>43</w:t>
+            </w:r>
+          </w:p>
+        </w:tc>
+        <w:tc>
+          <w:tcPr>
+            <w:tcW w:type="dxa" w:w="1008"/>
+          </w:tcPr>
+          <w:p>
+            <w:r>
+              <w:rPr>
+                <w:sz w:val="17"/>
+              </w:rPr>
+              <w:t>A</w:t>
+            </w:r>
+          </w:p>
+        </w:tc>
+        <w:tc>
+          <w:tcPr>
+            <w:tcW w:type="dxa" w:w="1008"/>
+          </w:tcPr>
+          <w:p>
+            <w:r>
+              <w:rPr>
+                <w:b/>
+                <w:color w:val="0F9D58"/>
+                <w:sz w:val="17"/>
+              </w:rPr>
+              <w:t>GO</w:t>
+            </w:r>
+          </w:p>
+        </w:tc>
+        <w:tc>
+          <w:tcPr>
+            <w:tcW w:type="dxa" w:w="1008"/>
+          </w:tcPr>
+          <w:p>
+            <w:r>
+              <w:rPr>
+                <w:sz w:val="17"/>
+              </w:rPr>
+              <w:t>12.9x</w:t>
+            </w:r>
+          </w:p>
+        </w:tc>
+        <w:tc>
+          <w:tcPr>
+            <w:tcW w:type="dxa" w:w="1008"/>
+          </w:tcPr>
+          <w:p>
+            <w:r>
+              <w:rPr>
+                <w:sz w:val="17"/>
+              </w:rPr>
+              <w:t>$1.28</w:t>
+            </w:r>
+          </w:p>
+        </w:tc>
+        <w:tc>
+          <w:tcPr>
+            <w:tcW w:type="dxa" w:w="1008"/>
+          </w:tcPr>
+          <w:p>
+            <w:r>
+              <w:rPr>
+                <w:sz w:val="17"/>
+              </w:rPr>
+              <w:t>+5.8%</w:t>
+            </w:r>
+          </w:p>
+        </w:tc>
+        <w:tc>
+          <w:tcPr>
+            <w:tcW w:type="dxa" w:w="1008"/>
+          </w:tcPr>
+          <w:p>
+            <w:r>
+              <w:rPr>
+                <w:sz w:val="17"/>
+              </w:rPr>
+              <w:t>+15.7%</w:t>
+            </w:r>
+          </w:p>
+        </w:tc>
+        <w:tc>
+          <w:tcPr>
+            <w:tcW w:type="dxa" w:w="1008"/>
+          </w:tcPr>
+          <w:p>
+            <w:r>
+              <w:rPr>
+                <w:sz w:val="17"/>
+              </w:rPr>
+              <w:t>7.7M</w:t>
+            </w:r>
+          </w:p>
+        </w:tc>
+        <w:tc>
+          <w:tcPr>
+            <w:tcW w:type="dxa" w:w="1008"/>
+          </w:tcPr>
+          <w:p>
+            <w:r>
+              <w:rPr>
+                <w:sz w:val="17"/>
+              </w:rPr>
+              <w:t>12 Health Care Stocks Moving In Wednesday's Pre-Ma</w:t>
             </w:r>
           </w:p>
         </w:tc>
@@ -1062,7 +1229,7 @@
               <w:rPr>
                 <w:sz w:val="17"/>
               </w:rPr>
-              <w:t>$10.32</w:t>
+              <w:t>$10.37</w:t>
             </w:r>
           </w:p>
         </w:tc>
@@ -1075,7 +1242,7 @@
               <w:rPr>
                 <w:sz w:val="17"/>
               </w:rPr>
-              <w:t>+20.1%</w:t>
+              <w:t>+20.7%</w:t>
             </w:r>
           </w:p>
         </w:tc>
@@ -1196,7 +1363,7 @@
               <w:rPr>
                 <w:sz w:val="17"/>
               </w:rPr>
-              <w:t>$26.73</w:t>
+              <w:t>$26.70</w:t>
             </w:r>
           </w:p>
         </w:tc>
@@ -1209,7 +1376,7 @@
               <w:rPr>
                 <w:sz w:val="17"/>
               </w:rPr>
-              <w:t>+38.9%</w:t>
+              <w:t>+38.8%</w:t>
             </w:r>
           </w:p>
         </w:tc>
@@ -1330,7 +1497,7 @@
               <w:rPr>
                 <w:sz w:val="17"/>
               </w:rPr>
-              <w:t>$12.69</w:t>
+              <w:t>$12.18</w:t>
             </w:r>
           </w:p>
         </w:tc>
@@ -1343,7 +1510,7 @@
               <w:rPr>
                 <w:sz w:val="17"/>
               </w:rPr>
-              <w:t>+22.5%</w:t>
+              <w:t>+17.6%</w:t>
             </w:r>
           </w:p>
         </w:tc>
@@ -1464,7 +1631,7 @@
               <w:rPr>
                 <w:sz w:val="17"/>
               </w:rPr>
-              <w:t>$6.23</w:t>
+              <w:t>$6.25</w:t>
             </w:r>
           </w:p>
         </w:tc>
@@ -1477,7 +1644,7 @@
               <w:rPr>
                 <w:sz w:val="17"/>
               </w:rPr>
-              <w:t>+5.6%</w:t>
+              <w:t>+5.9%</w:t>
             </w:r>
           </w:p>
         </w:tc>
@@ -1517,140 +1684,6 @@
                 <w:sz w:val="17"/>
               </w:rPr>
               <w:t>Sky Quarry Issues Request for Proposals to Acceler</w:t>
-            </w:r>
-          </w:p>
-        </w:tc>
-      </w:tr>
-      <w:tr>
-        <w:tc>
-          <w:tcPr>
-            <w:tcW w:type="dxa" w:w="1008"/>
-          </w:tcPr>
-          <w:p>
-            <w:r>
-              <w:rPr>
-                <w:sz w:val="17"/>
-              </w:rPr>
-              <w:t>GCTK</w:t>
-            </w:r>
-          </w:p>
-        </w:tc>
-        <w:tc>
-          <w:tcPr>
-            <w:tcW w:type="dxa" w:w="1008"/>
-          </w:tcPr>
-          <w:p>
-            <w:r>
-              <w:rPr>
-                <w:sz w:val="17"/>
-              </w:rPr>
-              <w:t>33</w:t>
-            </w:r>
-          </w:p>
-        </w:tc>
-        <w:tc>
-          <w:tcPr>
-            <w:tcW w:type="dxa" w:w="1008"/>
-          </w:tcPr>
-          <w:p>
-            <w:r>
-              <w:rPr>
-                <w:sz w:val="17"/>
-              </w:rPr>
-              <w:t>B</w:t>
-            </w:r>
-          </w:p>
-        </w:tc>
-        <w:tc>
-          <w:tcPr>
-            <w:tcW w:type="dxa" w:w="1008"/>
-          </w:tcPr>
-          <w:p>
-            <w:r>
-              <w:rPr>
-                <w:b/>
-                <w:color w:val="F4B400"/>
-                <w:sz w:val="17"/>
-              </w:rPr>
-              <w:t>WAIT</w:t>
-            </w:r>
-          </w:p>
-        </w:tc>
-        <w:tc>
-          <w:tcPr>
-            <w:tcW w:type="dxa" w:w="1008"/>
-          </w:tcPr>
-          <w:p>
-            <w:r>
-              <w:rPr>
-                <w:sz w:val="17"/>
-              </w:rPr>
-              <w:t>18.1x</w:t>
-            </w:r>
-          </w:p>
-        </w:tc>
-        <w:tc>
-          <w:tcPr>
-            <w:tcW w:type="dxa" w:w="1008"/>
-          </w:tcPr>
-          <w:p>
-            <w:r>
-              <w:rPr>
-                <w:sz w:val="17"/>
-              </w:rPr>
-              <w:t>$1.10</w:t>
-            </w:r>
-          </w:p>
-        </w:tc>
-        <w:tc>
-          <w:tcPr>
-            <w:tcW w:type="dxa" w:w="1008"/>
-          </w:tcPr>
-          <w:p>
-            <w:r>
-              <w:rPr>
-                <w:sz w:val="17"/>
-              </w:rPr>
-              <w:t>+30.8%</w:t>
-            </w:r>
-          </w:p>
-        </w:tc>
-        <w:tc>
-          <w:tcPr>
-            <w:tcW w:type="dxa" w:w="1008"/>
-          </w:tcPr>
-          <w:p>
-            <w:r>
-              <w:rPr>
-                <w:sz w:val="17"/>
-              </w:rPr>
-              <w:t>+21.9%</w:t>
-            </w:r>
-          </w:p>
-        </w:tc>
-        <w:tc>
-          <w:tcPr>
-            <w:tcW w:type="dxa" w:w="1008"/>
-          </w:tcPr>
-          <w:p>
-            <w:r>
-              <w:rPr>
-                <w:sz w:val="17"/>
-              </w:rPr>
-              <w:t>1.8M</w:t>
-            </w:r>
-          </w:p>
-        </w:tc>
-        <w:tc>
-          <w:tcPr>
-            <w:tcW w:type="dxa" w:w="1008"/>
-          </w:tcPr>
-          <w:p>
-            <w:r>
-              <w:rPr>
-                <w:sz w:val="17"/>
-              </w:rPr>
-              <w:t>Get insights into the top gainers and losers of We</w:t>
             </w:r>
           </w:p>
         </w:tc>
@@ -1732,7 +1765,7 @@
               <w:rPr>
                 <w:sz w:val="17"/>
               </w:rPr>
-              <w:t>$1.64</w:t>
+              <w:t>$1.63</w:t>
             </w:r>
           </w:p>
         </w:tc>
@@ -1745,7 +1778,7 @@
               <w:rPr>
                 <w:sz w:val="17"/>
               </w:rPr>
-              <w:t>+11.6%</w:t>
+              <w:t>+10.9%</w:t>
             </w:r>
           </w:p>
         </w:tc>
@@ -1799,7 +1832,7 @@
               <w:rPr>
                 <w:sz w:val="17"/>
               </w:rPr>
-              <w:t>WALD</w:t>
+              <w:t>AGIO</w:t>
             </w:r>
           </w:p>
         </w:tc>
@@ -1812,7 +1845,7 @@
               <w:rPr>
                 <w:sz w:val="17"/>
               </w:rPr>
-              <w:t>33</w:t>
+              <w:t>32</w:t>
             </w:r>
           </w:p>
         </w:tc>
@@ -1853,7 +1886,7 @@
               <w:rPr>
                 <w:sz w:val="17"/>
               </w:rPr>
-              <w:t>10.1x</w:t>
+              <w:t>4.5x</w:t>
             </w:r>
           </w:p>
         </w:tc>
@@ -1866,7 +1899,7 @@
               <w:rPr>
                 <w:sz w:val="17"/>
               </w:rPr>
-              <w:t>$1.01</w:t>
+              <w:t>$27.35</w:t>
             </w:r>
           </w:p>
         </w:tc>
@@ -1879,7 +1912,7 @@
               <w:rPr>
                 <w:sz w:val="17"/>
               </w:rPr>
-              <w:t>+29.6%</w:t>
+              <w:t>+10.3%</w:t>
             </w:r>
           </w:p>
         </w:tc>
@@ -1892,7 +1925,7 @@
               <w:rPr>
                 <w:sz w:val="17"/>
               </w:rPr>
-              <w:t>+33.5%</w:t>
+              <w:t>+6.8%</w:t>
             </w:r>
           </w:p>
         </w:tc>
@@ -1905,7 +1938,7 @@
               <w:rPr>
                 <w:sz w:val="17"/>
               </w:rPr>
-              <w:t>47.1M</w:t>
+              <w:t>53.6M</w:t>
             </w:r>
           </w:p>
         </w:tc>
@@ -1918,7 +1951,7 @@
               <w:rPr>
                 <w:sz w:val="17"/>
               </w:rPr>
-              <w:t>Waldencast announces conclusion of SEC investigati</w:t>
+              <w:t>Agios Pharmaceuticals (NASDAQ:AGIO) Q1 2026 Earnin</w:t>
             </w:r>
           </w:p>
         </w:tc>
@@ -2000,7 +2033,7 @@
               <w:rPr>
                 <w:sz w:val="17"/>
               </w:rPr>
-              <w:t>$21.00</w:t>
+              <w:t>$20.41</w:t>
             </w:r>
           </w:p>
         </w:tc>
@@ -2013,7 +2046,7 @@
               <w:rPr>
                 <w:sz w:val="17"/>
               </w:rPr>
-              <w:t>+20.1%</w:t>
+              <w:t>+16.7%</w:t>
             </w:r>
           </w:p>
         </w:tc>
@@ -2134,7 +2167,7 @@
               <w:rPr>
                 <w:sz w:val="17"/>
               </w:rPr>
-              <w:t>$9.78</w:t>
+              <w:t>$9.35</w:t>
             </w:r>
           </w:p>
         </w:tc>
@@ -2147,7 +2180,7 @@
               <w:rPr>
                 <w:sz w:val="17"/>
               </w:rPr>
-              <w:t>+8.6%</w:t>
+              <w:t>+3.7%</w:t>
             </w:r>
           </w:p>
         </w:tc>
@@ -2201,7 +2234,7 @@
               <w:rPr>
                 <w:sz w:val="17"/>
               </w:rPr>
-              <w:t>TRAW</w:t>
+              <w:t>CRBP</w:t>
             </w:r>
           </w:p>
         </w:tc>
@@ -2214,7 +2247,7 @@
               <w:rPr>
                 <w:sz w:val="17"/>
               </w:rPr>
-              <w:t>32</w:t>
+              <w:t>31</w:t>
             </w:r>
           </w:p>
         </w:tc>
@@ -2255,7 +2288,7 @@
               <w:rPr>
                 <w:sz w:val="17"/>
               </w:rPr>
-              <w:t>12.9x</w:t>
+              <w:t>6.9x</w:t>
             </w:r>
           </w:p>
         </w:tc>
@@ -2268,7 +2301,7 @@
               <w:rPr>
                 <w:sz w:val="17"/>
               </w:rPr>
-              <w:t>$1.36</w:t>
+              <w:t>$10.13</w:t>
             </w:r>
           </w:p>
         </w:tc>
@@ -2281,7 +2314,7 @@
               <w:rPr>
                 <w:sz w:val="17"/>
               </w:rPr>
-              <w:t>+12.5%</w:t>
+              <w:t>+3.1%</w:t>
             </w:r>
           </w:p>
         </w:tc>
@@ -2294,7 +2327,7 @@
               <w:rPr>
                 <w:sz w:val="17"/>
               </w:rPr>
-              <w:t>+15.7%</w:t>
+              <w:t>+5.1%</w:t>
             </w:r>
           </w:p>
         </w:tc>
@@ -2307,7 +2340,7 @@
               <w:rPr>
                 <w:sz w:val="17"/>
               </w:rPr>
-              <w:t>7.7M</w:t>
+              <w:t>16.0M</w:t>
             </w:r>
           </w:p>
         </w:tc>
@@ -2320,7 +2353,7 @@
               <w:rPr>
                 <w:sz w:val="17"/>
               </w:rPr>
-              <w:t>—</w:t>
+              <w:t>Spotify upgraded, Alibaba initiated: Wall Street's</w:t>
             </w:r>
           </w:p>
         </w:tc>
@@ -2402,7 +2435,7 @@
               <w:rPr>
                 <w:sz w:val="17"/>
               </w:rPr>
-              <w:t>$4.90</w:t>
+              <w:t>$4.64</w:t>
             </w:r>
           </w:p>
         </w:tc>
@@ -2415,7 +2448,7 @@
               <w:rPr>
                 <w:sz w:val="17"/>
               </w:rPr>
-              <w:t>-4.3%</w:t>
+              <w:t>-9.4%</w:t>
             </w:r>
           </w:p>
         </w:tc>
@@ -2455,6 +2488,140 @@
                 <w:sz w:val="17"/>
               </w:rPr>
               <w:t>Fully Booked Momentus Mission Advances Through Pre</w:t>
+            </w:r>
+          </w:p>
+        </w:tc>
+      </w:tr>
+      <w:tr>
+        <w:tc>
+          <w:tcPr>
+            <w:tcW w:type="dxa" w:w="1008"/>
+          </w:tcPr>
+          <w:p>
+            <w:r>
+              <w:rPr>
+                <w:sz w:val="17"/>
+              </w:rPr>
+              <w:t>NBP</w:t>
+            </w:r>
+          </w:p>
+        </w:tc>
+        <w:tc>
+          <w:tcPr>
+            <w:tcW w:type="dxa" w:w="1008"/>
+          </w:tcPr>
+          <w:p>
+            <w:r>
+              <w:rPr>
+                <w:sz w:val="17"/>
+              </w:rPr>
+              <w:t>29</w:t>
+            </w:r>
+          </w:p>
+        </w:tc>
+        <w:tc>
+          <w:tcPr>
+            <w:tcW w:type="dxa" w:w="1008"/>
+          </w:tcPr>
+          <w:p>
+            <w:r>
+              <w:rPr>
+                <w:sz w:val="17"/>
+              </w:rPr>
+              <w:t>C</w:t>
+            </w:r>
+          </w:p>
+        </w:tc>
+        <w:tc>
+          <w:tcPr>
+            <w:tcW w:type="dxa" w:w="1008"/>
+          </w:tcPr>
+          <w:p>
+            <w:r>
+              <w:rPr>
+                <w:b/>
+                <w:color w:val="DB4437"/>
+                <w:sz w:val="17"/>
+              </w:rPr>
+              <w:t>AVOID</w:t>
+            </w:r>
+          </w:p>
+        </w:tc>
+        <w:tc>
+          <w:tcPr>
+            <w:tcW w:type="dxa" w:w="1008"/>
+          </w:tcPr>
+          <w:p>
+            <w:r>
+              <w:rPr>
+                <w:sz w:val="17"/>
+              </w:rPr>
+              <w:t>7.3x</w:t>
+            </w:r>
+          </w:p>
+        </w:tc>
+        <w:tc>
+          <w:tcPr>
+            <w:tcW w:type="dxa" w:w="1008"/>
+          </w:tcPr>
+          <w:p>
+            <w:r>
+              <w:rPr>
+                <w:sz w:val="17"/>
+              </w:rPr>
+              <w:t>$2.54</w:t>
+            </w:r>
+          </w:p>
+        </w:tc>
+        <w:tc>
+          <w:tcPr>
+            <w:tcW w:type="dxa" w:w="1008"/>
+          </w:tcPr>
+          <w:p>
+            <w:r>
+              <w:rPr>
+                <w:sz w:val="17"/>
+              </w:rPr>
+              <w:t>+6.3%</w:t>
+            </w:r>
+          </w:p>
+        </w:tc>
+        <w:tc>
+          <w:tcPr>
+            <w:tcW w:type="dxa" w:w="1008"/>
+          </w:tcPr>
+          <w:p>
+            <w:r>
+              <w:rPr>
+                <w:sz w:val="17"/>
+              </w:rPr>
+              <w:t>+10.5%</w:t>
+            </w:r>
+          </w:p>
+        </w:tc>
+        <w:tc>
+          <w:tcPr>
+            <w:tcW w:type="dxa" w:w="1008"/>
+          </w:tcPr>
+          <w:p>
+            <w:r>
+              <w:rPr>
+                <w:sz w:val="17"/>
+              </w:rPr>
+              <w:t>96.5M</w:t>
+            </w:r>
+          </w:p>
+        </w:tc>
+        <w:tc>
+          <w:tcPr>
+            <w:tcW w:type="dxa" w:w="1008"/>
+          </w:tcPr>
+          <w:p>
+            <w:r>
+              <w:rPr>
+                <w:sz w:val="17"/>
+              </w:rPr>
+              <w:t>Daily – Vickers Top Buyers &amp; Sellers for 04/29/202</w:t>
             </w:r>
           </w:p>
         </w:tc>
@@ -2536,7 +2703,7 @@
               <w:rPr>
                 <w:sz w:val="17"/>
               </w:rPr>
-              <w:t>$3.93</w:t>
+              <w:t>$3.64</w:t>
             </w:r>
           </w:p>
         </w:tc>
@@ -2549,7 +2716,7 @@
               <w:rPr>
                 <w:sz w:val="17"/>
               </w:rPr>
-              <w:t>+3.1%</w:t>
+              <w:t>-4.5%</w:t>
             </w:r>
           </w:p>
         </w:tc>
@@ -2603,7 +2770,7 @@
               <w:rPr>
                 <w:sz w:val="17"/>
               </w:rPr>
-              <w:t>NBP</w:t>
+              <w:t>MAIA</w:t>
             </w:r>
           </w:p>
         </w:tc>
@@ -2616,7 +2783,7 @@
               <w:rPr>
                 <w:sz w:val="17"/>
               </w:rPr>
-              <w:t>23</w:t>
+              <w:t>21</w:t>
             </w:r>
           </w:p>
         </w:tc>
@@ -2657,7 +2824,7 @@
               <w:rPr>
                 <w:sz w:val="17"/>
               </w:rPr>
-              <w:t>7.3x</w:t>
+              <w:t>7.4x</w:t>
             </w:r>
           </w:p>
         </w:tc>
@@ -2670,7 +2837,7 @@
               <w:rPr>
                 <w:sz w:val="17"/>
               </w:rPr>
-              <w:t>$2.58</w:t>
+              <w:t>$1.39</w:t>
             </w:r>
           </w:p>
         </w:tc>
@@ -2683,7 +2850,7 @@
               <w:rPr>
                 <w:sz w:val="17"/>
               </w:rPr>
-              <w:t>+7.8%</w:t>
+              <w:t>+11.2%</w:t>
             </w:r>
           </w:p>
         </w:tc>
@@ -2696,7 +2863,7 @@
               <w:rPr>
                 <w:sz w:val="17"/>
               </w:rPr>
-              <w:t>+10.5%</w:t>
+              <w:t>+5.2%</w:t>
             </w:r>
           </w:p>
         </w:tc>
@@ -2709,7 +2876,7 @@
               <w:rPr>
                 <w:sz w:val="17"/>
               </w:rPr>
-              <w:t>96.5M</w:t>
+              <w:t>50.8M</w:t>
             </w:r>
           </w:p>
         </w:tc>
@@ -2722,7 +2889,141 @@
               <w:rPr>
                 <w:sz w:val="17"/>
               </w:rPr>
-              <w:t>Get insights into the top gainers and losers of Tu</w:t>
+              <w:t>—</w:t>
+            </w:r>
+          </w:p>
+        </w:tc>
+      </w:tr>
+      <w:tr>
+        <w:tc>
+          <w:tcPr>
+            <w:tcW w:type="dxa" w:w="1008"/>
+          </w:tcPr>
+          <w:p>
+            <w:r>
+              <w:rPr>
+                <w:sz w:val="17"/>
+              </w:rPr>
+              <w:t>TEO</w:t>
+            </w:r>
+          </w:p>
+        </w:tc>
+        <w:tc>
+          <w:tcPr>
+            <w:tcW w:type="dxa" w:w="1008"/>
+          </w:tcPr>
+          <w:p>
+            <w:r>
+              <w:rPr>
+                <w:sz w:val="17"/>
+              </w:rPr>
+              <w:t>17</w:t>
+            </w:r>
+          </w:p>
+        </w:tc>
+        <w:tc>
+          <w:tcPr>
+            <w:tcW w:type="dxa" w:w="1008"/>
+          </w:tcPr>
+          <w:p>
+            <w:r>
+              <w:rPr>
+                <w:sz w:val="17"/>
+              </w:rPr>
+              <w:t>D</w:t>
+            </w:r>
+          </w:p>
+        </w:tc>
+        <w:tc>
+          <w:tcPr>
+            <w:tcW w:type="dxa" w:w="1008"/>
+          </w:tcPr>
+          <w:p>
+            <w:r>
+              <w:rPr>
+                <w:b/>
+                <w:color w:val="DB4437"/>
+                <w:sz w:val="17"/>
+              </w:rPr>
+              <w:t>AVOID</w:t>
+            </w:r>
+          </w:p>
+        </w:tc>
+        <w:tc>
+          <w:tcPr>
+            <w:tcW w:type="dxa" w:w="1008"/>
+          </w:tcPr>
+          <w:p>
+            <w:r>
+              <w:rPr>
+                <w:sz w:val="17"/>
+              </w:rPr>
+              <w:t>4.4x</w:t>
+            </w:r>
+          </w:p>
+        </w:tc>
+        <w:tc>
+          <w:tcPr>
+            <w:tcW w:type="dxa" w:w="1008"/>
+          </w:tcPr>
+          <w:p>
+            <w:r>
+              <w:rPr>
+                <w:sz w:val="17"/>
+              </w:rPr>
+              <w:t>$11.94</w:t>
+            </w:r>
+          </w:p>
+        </w:tc>
+        <w:tc>
+          <w:tcPr>
+            <w:tcW w:type="dxa" w:w="1008"/>
+          </w:tcPr>
+          <w:p>
+            <w:r>
+              <w:rPr>
+                <w:sz w:val="17"/>
+              </w:rPr>
+              <w:t>+6.7%</w:t>
+            </w:r>
+          </w:p>
+        </w:tc>
+        <w:tc>
+          <w:tcPr>
+            <w:tcW w:type="dxa" w:w="1008"/>
+          </w:tcPr>
+          <w:p>
+            <w:r>
+              <w:rPr>
+                <w:sz w:val="17"/>
+              </w:rPr>
+              <w:t>+6.4%</w:t>
+            </w:r>
+          </w:p>
+        </w:tc>
+        <w:tc>
+          <w:tcPr>
+            <w:tcW w:type="dxa" w:w="1008"/>
+          </w:tcPr>
+          <w:p>
+            <w:r>
+              <w:rPr>
+                <w:sz w:val="17"/>
+              </w:rPr>
+              <w:t>86.0M</w:t>
+            </w:r>
+          </w:p>
+        </w:tc>
+        <w:tc>
+          <w:tcPr>
+            <w:tcW w:type="dxa" w:w="1008"/>
+          </w:tcPr>
+          <w:p>
+            <w:r>
+              <w:rPr>
+                <w:sz w:val="17"/>
+              </w:rPr>
+              <w:t>—</w:t>
             </w:r>
           </w:p>
         </w:tc>
@@ -2735,7 +3036,7 @@
         <w:pStyle w:val="Heading2"/>
       </w:pPr>
       <w:r>
-        <w:t>GO-Tier Picks — Top 4</w:t>
+        <w:t>GO-Tier Picks — Top 5</w:t>
       </w:r>
       <w:bookmarkEnd w:id="5"/>
     </w:p>
@@ -2768,6 +3069,22 @@
             <w:rStyle w:val="Hyperlink"/>
           </w:rPr>
           <w:t xml:space="preserve">FCEL</w:t>
+        </w:r>
+      </w:hyperlink>
+    </w:p>
+    <w:p>
+      <w:pPr>
+        <w:spacing w:after="20"/>
+      </w:pPr>
+      <w:r>
+        <w:t xml:space="preserve">  → </w:t>
+      </w:r>
+      <w:hyperlink w:anchor="ticker_TRAW">
+        <w:r>
+          <w:rPr>
+            <w:rStyle w:val="Hyperlink"/>
+          </w:rPr>
+          <w:t xml:space="preserve">TRAW</w:t>
         </w:r>
       </w:hyperlink>
     </w:p>
@@ -2961,7 +3278,7 @@
                 <w:b/>
                 <w:sz w:val="18"/>
               </w:rPr>
-              <w:t>$2.89</w:t>
+              <w:t>$2.48</w:t>
             </w:r>
           </w:p>
         </w:tc>
@@ -2975,7 +3292,7 @@
                 <w:b/>
                 <w:sz w:val="18"/>
               </w:rPr>
-              <w:t>+70.0%</w:t>
+              <w:t>+45.9%</w:t>
             </w:r>
           </w:p>
         </w:tc>
@@ -3031,7 +3348,7 @@
                 <w:b/>
                 <w:sz w:val="18"/>
               </w:rPr>
-              <w:t>60,195,303</w:t>
+              <w:t>82,348,040</w:t>
             </w:r>
           </w:p>
         </w:tc>
@@ -3192,7 +3509,7 @@
         <w:t>**SAGT Scalp Setup Brief**</w:t>
         <w:br/>
         <w:br/>
-        <w:t>SAGT is exploding +70% on massive 11.52x relative volume with an 80% gap up, likely driven by being highlighted as a top pre-market gainer creating momentum-chasing volume. The extremely low float (0M reported) suggests this could have violent moves in both directions with potential for quick squeezes but equally fast reversals. Look for entries on any pullback to VWAP or previous resistance-turned-support levels around $2.50-$2.60 if it holds above those levels with volume. Watch for volume deterioration above $3.00 as a signal that the momentum play may be exhausting and ready for a sharp pullback.</w:t>
+        <w:t>SAGT is exploding on 11.52x relative volume with an 80% gap up, likely driven by pre-market momentum as a top gainer, though the catalyst appears weak without fundamental news. **Key risk:** Extremely low float (0M reported) creates violent price swings that can gap against you instantly. **Ideal entry:** Wait for a pullback to $2.20-2.30 support zone or break above $2.55 with volume confirmation for continuation. **Watch:** Volume sustainability above 10x RVOL - if volume dies, this will collapse fast given the momentum-driven nature and lack of solid catalyst.</w:t>
       </w:r>
     </w:p>
     <w:p/>
@@ -3203,7 +3520,7 @@
           <w:color w:val="1A73E8"/>
           <w:sz w:val="18"/>
         </w:rPr>
-        <w:t>🔥 Top Catalyst  ·  1.0h ago  ·  ChartMill  ·  Low Impact</w:t>
+        <w:t>🔥 Top Catalyst  ·  1.5h ago  ·  ChartMill  ·  Low Impact</w:t>
       </w:r>
     </w:p>
     <w:p>
@@ -3388,7 +3705,7 @@
                 <w:b/>
                 <w:sz w:val="18"/>
               </w:rPr>
-              <w:t>$11.19</w:t>
+              <w:t>$11.10</w:t>
             </w:r>
           </w:p>
         </w:tc>
@@ -3402,7 +3719,7 @@
                 <w:b/>
                 <w:sz w:val="18"/>
               </w:rPr>
-              <w:t>+12.6%</w:t>
+              <w:t>+11.7%</w:t>
             </w:r>
           </w:p>
         </w:tc>
@@ -3458,7 +3775,7 @@
                 <w:b/>
                 <w:sz w:val="18"/>
               </w:rPr>
-              <w:t>810,445</w:t>
+              <w:t>2,535,497</w:t>
             </w:r>
           </w:p>
         </w:tc>
@@ -3619,7 +3936,7 @@
         <w:t>**FCEL Scalp Setup Brief**</w:t>
         <w:br/>
         <w:br/>
-        <w:t>FCEL is ripping on sympathy momentum from Bloom Energy's massive earnings beat and raised AI-powered outlook, lifting the entire fuel cell sector with nearly 10x relative volume. **Key risk:** This is pure sympathy play momentum that could reverse quickly once the initial pop fades, especially given FCEL's large 53M float. **Entry context:** Look for micro-pullbacks to VWAP or previous resistance around $10.80-$11.00 for quick scalps targeting $11.40-$11.60. **Watch:** Volume sustainability above 5x normal - if it drops below 3x RVOL, the momentum is dying and risk of sharp reversal increases significantly.</w:t>
+        <w:t>FCEL is surging 11.7% on massive 9.75x volume following Bloom Energy's blowout AI-driven earnings beat, creating sympathy momentum across the fuel cell sector. Key risk is the large 53M float which could lead to quick profit-taking once momentum fades. Look for entries on pullbacks to $10.80-$10.90 support with tight stops, targeting quick scalps to $11.30-$11.50 resistance. Watch for volume expansion above $11.20 - if it breaks with conviction, this could extend toward $12+ intraday.</w:t>
       </w:r>
     </w:p>
     <w:p/>
@@ -3630,7 +3947,7 @@
           <w:color w:val="1A73E8"/>
           <w:sz w:val="18"/>
         </w:rPr>
-        <w:t>🔥 Top Catalyst  ·  1.2h ago  ·  Yahoo Finance  ·  High Impact</w:t>
+        <w:t>🔥 Top Catalyst  ·  1.7h ago  ·  Yahoo Finance  ·  High Impact</w:t>
       </w:r>
     </w:p>
     <w:p>
@@ -3647,7 +3964,7 @@
           <w:color w:val="1A73E8"/>
           <w:sz w:val="16"/>
         </w:rPr>
-        <w:t>https://finance.yahoo.com/m/8e54a14b-3067-33e1-b481-1f6d99d58f56/bloom-energy-hikes-ai-fueled.html?.tsrc=rss</w:t>
+        <w:t>https://finance.yahoo.com/m/8e54a14b-3067-33e1-b481-1f6d99d58f56/bloom-energy-hikes-ai-fueled.html</w:t>
       </w:r>
     </w:p>
     <w:p>
@@ -3658,14 +3975,441 @@
       </w:pPr>
     </w:p>
     <w:p>
-      <w:bookmarkStart w:id="102" w:name="ticker_PRCH"/>
+      <w:bookmarkStart w:id="102" w:name="ticker_TRAW"/>
+      <w:pPr>
+        <w:pStyle w:val="Heading3"/>
+      </w:pPr>
+      <w:r>
+        <w:t>TRAW  ·  Traws Pharma Inc</w:t>
+      </w:r>
+      <w:bookmarkEnd w:id="102"/>
+    </w:p>
+    <w:p>
+      <w:r>
+        <w:rPr>
+          <w:sz w:val="20"/>
+        </w:rPr>
+        <w:t xml:space="preserve">Score: 43/50  ·  Grade: A  ·  </w:t>
+      </w:r>
+      <w:r>
+        <w:rPr>
+          <w:b/>
+          <w:color w:val="0F9D58"/>
+          <w:sz w:val="20"/>
+        </w:rPr>
+        <w:t>[ GO ]</w:t>
+      </w:r>
+    </w:p>
+    <w:p>
+      <w:r>
+        <w:rPr>
+          <w:rFonts w:ascii="Courier New" w:hAnsi="Courier New"/>
+          <w:sz w:val="18"/>
+        </w:rPr>
+        <w:t>●●●●●●●●●●●●○○○  7/9 criteria</w:t>
+      </w:r>
+    </w:p>
+    <w:tbl>
+      <w:tblPr>
+        <w:tblStyle w:val="TableGrid"/>
+        <w:tblW w:type="auto" w:w="0"/>
+        <w:tblLook w:firstColumn="1" w:firstRow="1" w:lastColumn="0" w:lastRow="0" w:noHBand="0" w:noVBand="1" w:val="04A0"/>
+      </w:tblPr>
+      <w:tblGrid>
+        <w:gridCol w:w="1680"/>
+        <w:gridCol w:w="1680"/>
+        <w:gridCol w:w="1680"/>
+        <w:gridCol w:w="1680"/>
+        <w:gridCol w:w="1680"/>
+        <w:gridCol w:w="1680"/>
+      </w:tblGrid>
+      <w:tr>
+        <w:tc>
+          <w:tcPr>
+            <w:tcW w:type="dxa" w:w="1680"/>
+            <w:shd w:val="clear" w:color="auto" w:fill="2C2C44"/>
+          </w:tcPr>
+          <w:p>
+            <w:r>
+              <w:rPr>
+                <w:b/>
+                <w:color w:val="9A9AB0"/>
+                <w:sz w:val="16"/>
+              </w:rPr>
+              <w:t>Price</w:t>
+            </w:r>
+          </w:p>
+        </w:tc>
+        <w:tc>
+          <w:tcPr>
+            <w:tcW w:type="dxa" w:w="1680"/>
+            <w:shd w:val="clear" w:color="auto" w:fill="2C2C44"/>
+          </w:tcPr>
+          <w:p>
+            <w:r>
+              <w:rPr>
+                <w:b/>
+                <w:color w:val="9A9AB0"/>
+                <w:sz w:val="16"/>
+              </w:rPr>
+              <w:t>Change%</w:t>
+            </w:r>
+          </w:p>
+        </w:tc>
+        <w:tc>
+          <w:tcPr>
+            <w:tcW w:type="dxa" w:w="1680"/>
+            <w:shd w:val="clear" w:color="auto" w:fill="2C2C44"/>
+          </w:tcPr>
+          <w:p>
+            <w:r>
+              <w:rPr>
+                <w:b/>
+                <w:color w:val="9A9AB0"/>
+                <w:sz w:val="16"/>
+              </w:rPr>
+              <w:t>Gap%</w:t>
+            </w:r>
+          </w:p>
+        </w:tc>
+        <w:tc>
+          <w:tcPr>
+            <w:tcW w:type="dxa" w:w="1680"/>
+            <w:shd w:val="clear" w:color="auto" w:fill="2C2C44"/>
+          </w:tcPr>
+          <w:p>
+            <w:r>
+              <w:rPr>
+                <w:b/>
+                <w:color w:val="9A9AB0"/>
+                <w:sz w:val="16"/>
+              </w:rPr>
+              <w:t>RVOL</w:t>
+            </w:r>
+          </w:p>
+        </w:tc>
+        <w:tc>
+          <w:tcPr>
+            <w:tcW w:type="dxa" w:w="1680"/>
+            <w:shd w:val="clear" w:color="auto" w:fill="2C2C44"/>
+          </w:tcPr>
+          <w:p>
+            <w:r>
+              <w:rPr>
+                <w:b/>
+                <w:color w:val="9A9AB0"/>
+                <w:sz w:val="16"/>
+              </w:rPr>
+              <w:t>Float M</w:t>
+            </w:r>
+          </w:p>
+        </w:tc>
+        <w:tc>
+          <w:tcPr>
+            <w:tcW w:type="dxa" w:w="1680"/>
+            <w:shd w:val="clear" w:color="auto" w:fill="2C2C44"/>
+          </w:tcPr>
+          <w:p>
+            <w:r>
+              <w:rPr>
+                <w:b/>
+                <w:color w:val="9A9AB0"/>
+                <w:sz w:val="16"/>
+              </w:rPr>
+              <w:t>Volume</w:t>
+            </w:r>
+          </w:p>
+        </w:tc>
+      </w:tr>
+      <w:tr>
+        <w:tc>
+          <w:tcPr>
+            <w:tcW w:type="dxa" w:w="1680"/>
+          </w:tcPr>
+          <w:p>
+            <w:r>
+              <w:rPr>
+                <w:b/>
+                <w:sz w:val="18"/>
+              </w:rPr>
+              <w:t>$1.28</w:t>
+            </w:r>
+          </w:p>
+        </w:tc>
+        <w:tc>
+          <w:tcPr>
+            <w:tcW w:type="dxa" w:w="1680"/>
+          </w:tcPr>
+          <w:p>
+            <w:r>
+              <w:rPr>
+                <w:b/>
+                <w:sz w:val="18"/>
+              </w:rPr>
+              <w:t>+5.8%</w:t>
+            </w:r>
+          </w:p>
+        </w:tc>
+        <w:tc>
+          <w:tcPr>
+            <w:tcW w:type="dxa" w:w="1680"/>
+          </w:tcPr>
+          <w:p>
+            <w:r>
+              <w:rPr>
+                <w:b/>
+                <w:sz w:val="18"/>
+              </w:rPr>
+              <w:t>+15.7%</w:t>
+            </w:r>
+          </w:p>
+        </w:tc>
+        <w:tc>
+          <w:tcPr>
+            <w:tcW w:type="dxa" w:w="1680"/>
+          </w:tcPr>
+          <w:p>
+            <w:r>
+              <w:rPr>
+                <w:b/>
+                <w:sz w:val="18"/>
+              </w:rPr>
+              <w:t>12.9x</w:t>
+            </w:r>
+          </w:p>
+        </w:tc>
+        <w:tc>
+          <w:tcPr>
+            <w:tcW w:type="dxa" w:w="1680"/>
+          </w:tcPr>
+          <w:p>
+            <w:r>
+              <w:rPr>
+                <w:b/>
+                <w:sz w:val="18"/>
+              </w:rPr>
+              <w:t>7.7M</w:t>
+            </w:r>
+          </w:p>
+        </w:tc>
+        <w:tc>
+          <w:tcPr>
+            <w:tcW w:type="dxa" w:w="1680"/>
+          </w:tcPr>
+          <w:p>
+            <w:r>
+              <w:rPr>
+                <w:b/>
+                <w:sz w:val="18"/>
+              </w:rPr>
+              <w:t>182,590</w:t>
+            </w:r>
+          </w:p>
+        </w:tc>
+      </w:tr>
+    </w:tbl>
+    <w:p/>
+    <w:p>
+      <w:r>
+        <w:rPr>
+          <w:rFonts w:ascii="Courier New" w:hAnsi="Courier New"/>
+          <w:sz w:val="17"/>
+        </w:rPr>
+        <w:t xml:space="preserve">  Catalyst          ████████████ 15/15</w:t>
+      </w:r>
+    </w:p>
+    <w:p>
+      <w:r>
+        <w:rPr>
+          <w:rFonts w:ascii="Courier New" w:hAnsi="Courier New"/>
+          <w:sz w:val="17"/>
+        </w:rPr>
+        <w:t xml:space="preserve">  RVOL              ████████████ 12/12</w:t>
+      </w:r>
+    </w:p>
+    <w:p>
+      <w:r>
+        <w:rPr>
+          <w:rFonts w:ascii="Courier New" w:hAnsi="Courier New"/>
+          <w:sz w:val="17"/>
+        </w:rPr>
+        <w:t xml:space="preserve">  Price Action      ███████░░░░░ 6/10</w:t>
+      </w:r>
+    </w:p>
+    <w:p>
+      <w:r>
+        <w:rPr>
+          <w:rFonts w:ascii="Courier New" w:hAnsi="Courier New"/>
+          <w:sz w:val="17"/>
+        </w:rPr>
+        <w:t xml:space="preserve">  Float             ██████████░░ 7/8</w:t>
+      </w:r>
+    </w:p>
+    <w:p>
+      <w:r>
+        <w:rPr>
+          <w:rFonts w:ascii="Courier New" w:hAnsi="Courier New"/>
+          <w:sz w:val="17"/>
+        </w:rPr>
+        <w:t xml:space="preserve">  Price Range       ███████░░░░░ 3/5</w:t>
+      </w:r>
+    </w:p>
+    <w:p>
+      <w:pPr>
+        <w:spacing w:before="0" w:after="0"/>
+      </w:pPr>
+      <w:r>
+        <w:rPr>
+          <w:sz w:val="18"/>
+        </w:rPr>
+        <w:t xml:space="preserve">  ✅  Has catalyst</w:t>
+      </w:r>
+    </w:p>
+    <w:p>
+      <w:pPr>
+        <w:spacing w:before="0" w:after="0"/>
+      </w:pPr>
+      <w:r>
+        <w:rPr>
+          <w:sz w:val="18"/>
+        </w:rPr>
+        <w:t xml:space="preserve">  ⬜  High-impact catalyst</w:t>
+      </w:r>
+    </w:p>
+    <w:p>
+      <w:pPr>
+        <w:spacing w:before="0" w:after="0"/>
+      </w:pPr>
+      <w:r>
+        <w:rPr>
+          <w:sz w:val="18"/>
+        </w:rPr>
+        <w:t xml:space="preserve">  ✅  Fresh catalyst (&lt;12h)</w:t>
+      </w:r>
+    </w:p>
+    <w:p>
+      <w:pPr>
+        <w:spacing w:before="0" w:after="0"/>
+      </w:pPr>
+      <w:r>
+        <w:rPr>
+          <w:sz w:val="18"/>
+        </w:rPr>
+        <w:t xml:space="preserve">  ✅  RVOL ≥ 3x</w:t>
+      </w:r>
+    </w:p>
+    <w:p>
+      <w:pPr>
+        <w:spacing w:before="0" w:after="0"/>
+      </w:pPr>
+      <w:r>
+        <w:rPr>
+          <w:sz w:val="18"/>
+        </w:rPr>
+        <w:t xml:space="preserve">  ✅  RVOL ≥ 5x</w:t>
+      </w:r>
+    </w:p>
+    <w:p>
+      <w:pPr>
+        <w:spacing w:before="0" w:after="0"/>
+      </w:pPr>
+      <w:r>
+        <w:rPr>
+          <w:sz w:val="18"/>
+        </w:rPr>
+        <w:t xml:space="preserve">  ✅  Float ≤ 50M</w:t>
+      </w:r>
+    </w:p>
+    <w:p>
+      <w:pPr>
+        <w:spacing w:before="0" w:after="0"/>
+      </w:pPr>
+      <w:r>
+        <w:rPr>
+          <w:sz w:val="18"/>
+        </w:rPr>
+        <w:t xml:space="preserve">  ✅  Price in range ($0.50–$30)</w:t>
+      </w:r>
+    </w:p>
+    <w:p>
+      <w:pPr>
+        <w:spacing w:before="0" w:after="0"/>
+      </w:pPr>
+      <w:r>
+        <w:rPr>
+          <w:sz w:val="18"/>
+        </w:rPr>
+        <w:t xml:space="preserve">  ✅  Gap ≥ 5%</w:t>
+      </w:r>
+    </w:p>
+    <w:p>
+      <w:pPr>
+        <w:spacing w:before="0" w:after="0"/>
+      </w:pPr>
+      <w:r>
+        <w:rPr>
+          <w:sz w:val="18"/>
+        </w:rPr>
+        <w:t xml:space="preserve">  ⬜  Change ≥ 10%</w:t>
+      </w:r>
+    </w:p>
+    <w:p/>
+    <w:p>
+      <w:r>
+        <w:rPr>
+          <w:i/>
+          <w:sz w:val="19"/>
+        </w:rPr>
+        <w:t>**TRAW Scalp Setup Brief**</w:t>
+        <w:br/>
+        <w:br/>
+        <w:t>TRAW is running on healthcare sector momentum with 12.9x relative volume after gapping up 15.7% on pre-market coverage mentions. Key risk is the low $1.28 price point making it susceptible to volatile swings and potential wash-out moves below $1.20 support. Look for long entries on pullbacks to the $1.25-$1.27 range with tight stops, targeting quick scalps to $1.35-$1.40 resistance. Watch for volume confirmation on any bounce - if volume dies on pullbacks, this could fade quickly given the small 8M float.</w:t>
+      </w:r>
+    </w:p>
+    <w:p/>
+    <w:p>
+      <w:r>
+        <w:rPr>
+          <w:b/>
+          <w:color w:val="1A73E8"/>
+          <w:sz w:val="18"/>
+        </w:rPr>
+        <w:t>🔥 Top Catalyst  ·  5.9h ago  ·  Benzinga  ·  Low Impact</w:t>
+      </w:r>
+    </w:p>
+    <w:p>
+      <w:r>
+        <w:rPr>
+          <w:sz w:val="19"/>
+        </w:rPr>
+        <w:t>12 Health Care Stocks Moving In Wednesday's Pre-Market Session</w:t>
+      </w:r>
+    </w:p>
+    <w:p>
+      <w:r>
+        <w:rPr>
+          <w:color w:val="1A73E8"/>
+          <w:sz w:val="16"/>
+        </w:rPr>
+        <w:t>https://finnhub.io/api/news?id=5b8295bbb8d41723aec8f124d4f0abfb35b2c36b71f7fc21d33a2636e2189ddd</w:t>
+      </w:r>
+    </w:p>
+    <w:p>
+      <w:pPr>
+        <w:pBdr>
+          <w:bottom w:val="single" w:sz="4" w:space="1" w:color="1A73E8"/>
+        </w:pBdr>
+      </w:pPr>
+    </w:p>
+    <w:p>
+      <w:bookmarkStart w:id="103" w:name="ticker_PRCH"/>
       <w:pPr>
         <w:pStyle w:val="Heading3"/>
       </w:pPr>
       <w:r>
         <w:t>PRCH  ·  Porch Group Inc</w:t>
       </w:r>
-      <w:bookmarkEnd w:id="102"/>
+      <w:bookmarkEnd w:id="103"/>
     </w:p>
     <w:p>
       <w:r>
@@ -3815,7 +4559,7 @@
                 <w:b/>
                 <w:sz w:val="18"/>
               </w:rPr>
-              <w:t>$10.32</w:t>
+              <w:t>$10.37</w:t>
             </w:r>
           </w:p>
         </w:tc>
@@ -3829,7 +4573,7 @@
                 <w:b/>
                 <w:sz w:val="18"/>
               </w:rPr>
-              <w:t>+20.1%</w:t>
+              <w:t>+20.7%</w:t>
             </w:r>
           </w:p>
         </w:tc>
@@ -3885,7 +4629,7 @@
                 <w:b/>
                 <w:sz w:val="18"/>
               </w:rPr>
-              <w:t>741,012</w:t>
+              <w:t>2,072,634</w:t>
             </w:r>
           </w:p>
         </w:tc>
@@ -4043,10 +4787,10 @@
           <w:i/>
           <w:sz w:val="19"/>
         </w:rPr>
-        <w:t>**PRCH Scalp Setup Brief**</w:t>
+        <w:t>**PRCH Scalp Setup - GO**</w:t>
         <w:br/>
         <w:br/>
-        <w:t>PRCH is running +20% on strong Q1 earnings with raised guidance, showing exceptional 6.48x relative volume that confirms institutional interest. Key risk is the large 82M float which could absorb momentum quickly once the initial wave subsides. Look for pullback entries on any dip toward $9.80-$10.00 support with tight stops, targeting quick 2-3% scalps on bounce plays. Watch for volume to maintain above 2-3x average - if it drops significantly, momentum is likely exhausted.</w:t>
+        <w:t>PRCH is running +20.7% on strong Q1 earnings with raised guidance, backed by massive 6.48x relative volume indicating serious institutional interest. The 82M float creates moderate resistance to quick moves, so expect choppier action than typical low-float runners. Look for entries on pullbacks to VWAP or key support levels rather than chasing the current momentum. Watch for volume confirmation on any breakout attempts - if volume starts dying, this could fade quickly given the larger float.</w:t>
       </w:r>
     </w:p>
     <w:p/>
@@ -4057,7 +4801,7 @@
           <w:color w:val="1A73E8"/>
           <w:sz w:val="18"/>
         </w:rPr>
-        <w:t>🔥 Top Catalyst  ·  6.4h ago  ·  Yahoo Finance  ·  High Impact</w:t>
+        <w:t>🔥 Top Catalyst  ·  6.8h ago  ·  Yahoo Finance  ·  High Impact</w:t>
       </w:r>
     </w:p>
     <w:p>
@@ -4085,14 +4829,14 @@
       </w:pPr>
     </w:p>
     <w:p>
-      <w:bookmarkStart w:id="103" w:name="ticker_KALV"/>
+      <w:bookmarkStart w:id="104" w:name="ticker_KALV"/>
       <w:pPr>
         <w:pStyle w:val="Heading3"/>
       </w:pPr>
       <w:r>
         <w:t>KALV  ·  KalVista Pharmaceuticals Inc</w:t>
       </w:r>
-      <w:bookmarkEnd w:id="103"/>
+      <w:bookmarkEnd w:id="104"/>
     </w:p>
     <w:p>
       <w:r>
@@ -4242,7 +4986,7 @@
                 <w:b/>
                 <w:sz w:val="18"/>
               </w:rPr>
-              <w:t>$26.73</w:t>
+              <w:t>$26.70</w:t>
             </w:r>
           </w:p>
         </w:tc>
@@ -4256,7 +5000,7 @@
                 <w:b/>
                 <w:sz w:val="18"/>
               </w:rPr>
-              <w:t>+38.9%</w:t>
+              <w:t>+38.8%</w:t>
             </w:r>
           </w:p>
         </w:tc>
@@ -4312,7 +5056,7 @@
                 <w:b/>
                 <w:sz w:val="18"/>
               </w:rPr>
-              <w:t>32,046,743</w:t>
+              <w:t>36,781,661</w:t>
             </w:r>
           </w:p>
         </w:tc>
@@ -4470,10 +5214,10 @@
           <w:i/>
           <w:sz w:val="19"/>
         </w:rPr>
-        <w:t>**KALV Scalp Setup - Strong Momentum Play**</w:t>
+        <w:t>**KALV Scalp Setup Brief**</w:t>
         <w:br/>
         <w:br/>
-        <w:t>KALV is running hard on 6.39x relative volume with a 38.9% gap up, likely driven by pre-market momentum and high retail interest in the low-float biotech name. Key risk is the massive gap with no obvious fundamental catalyst beyond being a top gainer, making this purely technical momentum that could reverse quickly. Look for entries on pullbacks to VWAP or previous resistance levels around $25-26 for continuation plays toward $30. Watch for volume to sustain above 2x average - if volume dies, this setup loses its edge fast.</w:t>
+        <w:t>KALV is ripping +38.8% on 6.39x relative volume, likely driven by pre-market attention as a top gainer with strong momentum continuation potential. The 38M float provides decent liquidity but watch for potential volatility spikes during heavy volume periods. Look for entries on pullbacks to support levels or breakouts above key resistance with volume confirmation - avoid chasing the initial gap-up. Key risk is the lack of a specific fundamental catalyst beyond being a momentum play, so watch for any sudden volume drops that could signal profit-taking and rapid reversals.</w:t>
       </w:r>
     </w:p>
     <w:p/>
@@ -4484,7 +5228,7 @@
           <w:color w:val="1A73E8"/>
           <w:sz w:val="18"/>
         </w:rPr>
-        <w:t>🔥 Top Catalyst  ·  1.0h ago  ·  ChartMill  ·  Low Impact</w:t>
+        <w:t>🔥 Top Catalyst  ·  1.5h ago  ·  ChartMill  ·  Low Impact</w:t>
       </w:r>
     </w:p>
     <w:p>
@@ -4537,7 +5281,7 @@
         <w:rPr>
           <w:sz w:val="17"/>
         </w:rPr>
-        <w:t xml:space="preserve">  [Low Impact  1.0h  ChartMill]  Get insights into the top gainers and losers of Wednesday's pre-market session.</w:t>
+        <w:t xml:space="preserve">  [Low Impact  1.5h  ChartMill]  Get insights into the top gainers and losers of Wednesday's pre-market session.</w:t>
       </w:r>
     </w:p>
     <w:p>
@@ -4548,7 +5292,7 @@
         <w:rPr>
           <w:sz w:val="17"/>
         </w:rPr>
-        <w:t xml:space="preserve">  [Low Impact  6.3h  Finnhub]  Sagtec Global Limited Achieves Record Revenue of US$19.1 Million in Fiscal Year 2025, Marking 49% Year-over-Year Growth</w:t>
+        <w:t xml:space="preserve">  [Low Impact  6.7h  Finnhub]  Sagtec Global Limited Achieves Record Revenue of US$19.1 Million in Fiscal Year 2025, Marking 49% Year-over-Year Growth</w:t>
       </w:r>
     </w:p>
     <w:p>
@@ -4559,7 +5303,7 @@
         <w:rPr>
           <w:sz w:val="17"/>
         </w:rPr>
-        <w:t xml:space="preserve">  [Low Impact  23.6h  Yahoo Finance]  CORRECTION -- Sagtec Global to Announce Fiscal Year 2025 Financial Results on April 29, 2026</w:t>
+        <w:t xml:space="preserve">  [Low Impact  6.8h  Benzinga]  Earnings Scheduled For April 29, 2026</w:t>
       </w:r>
     </w:p>
     <w:p>
@@ -4570,7 +5314,18 @@
         <w:rPr>
           <w:sz w:val="17"/>
         </w:rPr>
-        <w:t xml:space="preserve">  [Low Impact  29.0h  Finnhub]  Sagtec Global to Announce Fiscal Year 2025 Financial Results on April 29, 2026</w:t>
+        <w:t xml:space="preserve">  [Low Impact  24.1h  Yahoo Finance]  CORRECTION -- Sagtec Global to Announce Fiscal Year 2025 Financial Results on April 29, 2026</w:t>
+      </w:r>
+    </w:p>
+    <w:p>
+      <w:pPr>
+        <w:spacing w:after="20"/>
+      </w:pPr>
+      <w:r>
+        <w:rPr>
+          <w:sz w:val="17"/>
+        </w:rPr>
+        <w:t xml:space="preserve">  [Low Impact  29.4h  Finnhub]  Sagtec Global to Announce Fiscal Year 2025 Financial Results on April 29, 2026</w:t>
       </w:r>
     </w:p>
     <w:p>
@@ -4589,7 +5344,7 @@
         <w:rPr>
           <w:sz w:val="17"/>
         </w:rPr>
-        <w:t xml:space="preserve">  [High Impact  1.2h  Yahoo Finance]  Bloom Energy Hikes AI-Fueled Outlook Above Views After Huge Earnings Beat</w:t>
+        <w:t xml:space="preserve">  [High Impact  1.7h  Yahoo Finance]  Bloom Energy Hikes AI-Fueled Outlook Above Views After Huge Earnings Beat</w:t>
       </w:r>
     </w:p>
     <w:p>
@@ -4600,7 +5355,7 @@
         <w:rPr>
           <w:sz w:val="17"/>
         </w:rPr>
-        <w:t xml:space="preserve">  [Low Impact  30.6h  Yahoo Entertainment]  Is FuelCell Energy, Inc. (FCEL) Among the Best Hydrogen and Fuel Cell Stocks to Buy Now?</w:t>
+        <w:t xml:space="preserve">  [Low Impact  5.9h  Benzinga]  12 Industrials Stocks Moving In Wednesday's Pre-Market Session</w:t>
       </w:r>
     </w:p>
     <w:p>
@@ -4611,7 +5366,37 @@
         <w:rPr>
           <w:sz w:val="17"/>
         </w:rPr>
-        <w:t xml:space="preserve">  [Low Impact  44.9h  Yahoo Finance]  FuelCell Energy Is Up 80% in April. Should You Buy Now?</w:t>
+        <w:t xml:space="preserve">  [Low Impact  31.0h  Yahoo Finance]  Is FuelCell Energy, Inc. (FCEL) Among the Best Hydrogen and Fuel Cell Stocks to Buy Now?</w:t>
+      </w:r>
+    </w:p>
+    <w:p>
+      <w:pPr>
+        <w:spacing w:after="20"/>
+      </w:pPr>
+      <w:r>
+        <w:rPr>
+          <w:sz w:val="17"/>
+        </w:rPr>
+        <w:t xml:space="preserve">  [Low Impact  45.7h  The Motley Fool]  FuelCell Energy Is Up 80% in April. Should You Buy Now?</w:t>
+      </w:r>
+    </w:p>
+    <w:p>
+      <w:r>
+        <w:rPr>
+          <w:b/>
+        </w:rPr>
+        <w:t>TRAW  ·  Traws Pharma Inc</w:t>
+      </w:r>
+    </w:p>
+    <w:p>
+      <w:pPr>
+        <w:spacing w:after="20"/>
+      </w:pPr>
+      <w:r>
+        <w:rPr>
+          <w:sz w:val="17"/>
+        </w:rPr>
+        <w:t xml:space="preserve">  [Low Impact  5.9h  Benzinga]  12 Health Care Stocks Moving In Wednesday's Pre-Market Session</w:t>
       </w:r>
     </w:p>
     <w:p>
@@ -4630,7 +5415,7 @@
         <w:rPr>
           <w:sz w:val="17"/>
         </w:rPr>
-        <w:t xml:space="preserve">  [High Impact  6.4h  Yahoo Finance]  Porch Group Inc (PRCH) Q1 2026 Earnings Call Highlights: Strong Growth and Raised Guidance</w:t>
+        <w:t xml:space="preserve">  [High Impact  6.8h  Yahoo Finance]  Porch Group Inc (PRCH) Q1 2026 Earnings Call Highlights: Strong Growth and Raised Guidance</w:t>
       </w:r>
     </w:p>
     <w:p>
@@ -4641,7 +5426,7 @@
         <w:rPr>
           <w:sz w:val="17"/>
         </w:rPr>
-        <w:t xml:space="preserve">  [High Impact  16.9h  ChartMill]  Porch Group (NASDAQ:PRCH) Surges After Q1 Earnings Beat and Raised Guidance</w:t>
+        <w:t xml:space="preserve">  [High Impact  17.3h  ChartMill]  Porch Group (NASDAQ:PRCH) Surges After Q1 Earnings Beat and Raised Guidance</w:t>
       </w:r>
     </w:p>
     <w:p>
@@ -4652,7 +5437,7 @@
         <w:rPr>
           <w:sz w:val="17"/>
         </w:rPr>
-        <w:t xml:space="preserve">  [Low Impact  13.9h  Yahoo Finance]  Porch Group Q1 Earnings Call Highlights</w:t>
+        <w:t xml:space="preserve">  [Low Impact  14.3h  Yahoo Finance]  Porch Group Q1 Earnings Call Highlights</w:t>
       </w:r>
     </w:p>
     <w:p>
@@ -4663,7 +5448,7 @@
         <w:rPr>
           <w:sz w:val="17"/>
         </w:rPr>
-        <w:t xml:space="preserve">  [Low Impact  14.4h  SeekingAlpha]  Porch Group, Inc. 2026 Q1 - Results - Earnings Call Presentation</w:t>
+        <w:t xml:space="preserve">  [Low Impact  14.9h  SeekingAlpha]  Porch Group, Inc. 2026 Q1 - Results - Earnings Call Presentation</w:t>
       </w:r>
     </w:p>
     <w:p>
@@ -4674,7 +5459,7 @@
         <w:rPr>
           <w:sz w:val="17"/>
         </w:rPr>
-        <w:t xml:space="preserve">  [Low Impact  16.3h  Yahoo Finance]  Porch Group, Inc. (PRCH) Reports Q1 Loss, Beats Revenue Estimates</w:t>
+        <w:t xml:space="preserve">  [Low Impact  16.7h  Yahoo Finance]  Porch Group, Inc. (PRCH) Reports Q1 Loss, Beats Revenue Estimates</w:t>
       </w:r>
     </w:p>
     <w:p>
@@ -4685,7 +5470,7 @@
         <w:rPr>
           <w:sz w:val="17"/>
         </w:rPr>
-        <w:t xml:space="preserve">  [Low Impact  16.5h  ChartMill]  Get insights into the top gainers and losers of Tuesday's after-hours session.</w:t>
+        <w:t xml:space="preserve">  [Low Impact  17.0h  ChartMill]  Get insights into the top gainers and losers of Tuesday's after-hours session.</w:t>
       </w:r>
     </w:p>
     <w:p>
@@ -4704,7 +5489,7 @@
         <w:rPr>
           <w:sz w:val="17"/>
         </w:rPr>
-        <w:t xml:space="preserve">  [Low Impact  1.0h  ChartMill]  Get insights into the top gainers and losers of Wednesday's pre-market session.</w:t>
+        <w:t xml:space="preserve">  [Low Impact  1.5h  ChartMill]  Get insights into the top gainers and losers of Wednesday's pre-market session.</w:t>
       </w:r>
     </w:p>
     <w:p>
@@ -4715,7 +5500,7 @@
         <w:rPr>
           <w:sz w:val="17"/>
         </w:rPr>
-        <w:t xml:space="preserve">  [Low Impact  1.5h  Yahoo Finance]  Top Premarket Gainers</w:t>
+        <w:t xml:space="preserve">  [Low Impact  1.9h  Yahoo Finance]  Top Premarket Gainers</w:t>
       </w:r>
     </w:p>
     <w:p>
@@ -4726,7 +5511,7 @@
         <w:rPr>
           <w:sz w:val="17"/>
         </w:rPr>
-        <w:t xml:space="preserve">  [Low Impact  1.8h  Yahoo Finance]  Chiesi Group to Acquire KalVista Pharmaceuticals, Expanding its Global Rare Disease Portfolio</w:t>
+        <w:t xml:space="preserve">  [Low Impact  2.1h  Yahoo Finance]  KalVista Pharmaceuticals to Be Acquired by Chiesi Group for $1.9 Billion</w:t>
       </w:r>
     </w:p>
     <w:p>
@@ -4737,7 +5522,7 @@
         <w:rPr>
           <w:sz w:val="17"/>
         </w:rPr>
-        <w:t xml:space="preserve">  [Low Impact  5.6h  Finnhub]  Italian drugmaker Chiesi to buy KalVista for $1.9 billion</w:t>
+        <w:t xml:space="preserve">  [Low Impact  2.3h  Yahoo Finance]  Chiesi Group to Acquire KalVista Pharmaceuticals, Expanding its Global Rare Disease Portfolio</w:t>
       </w:r>
     </w:p>
     <w:p>
@@ -4748,7 +5533,18 @@
         <w:rPr>
           <w:sz w:val="17"/>
         </w:rPr>
-        <w:t xml:space="preserve">  [Low Impact  5.9h  Finnhub]  KalVista Pharmaceuticals : Chiesi Group to Acquire KalVista Pharmaceuticals, Expanding its Global Rare Disease Portfolio</w:t>
+        <w:t xml:space="preserve">  [Low Impact  5.9h  Benzinga]  12 Health Care Stocks Moving In Wednesday's Pre-Market Session</w:t>
+      </w:r>
+    </w:p>
+    <w:p>
+      <w:pPr>
+        <w:spacing w:after="20"/>
+      </w:pPr>
+      <w:r>
+        <w:rPr>
+          <w:sz w:val="17"/>
+        </w:rPr>
+        <w:t xml:space="preserve">  [Low Impact  6.0h  Finnhub]  Italian drugmaker Chiesi to buy KalVista for $1.9 billion</w:t>
       </w:r>
     </w:p>
     <w:p>
@@ -4767,7 +5563,7 @@
         <w:rPr>
           <w:sz w:val="17"/>
         </w:rPr>
-        <w:t xml:space="preserve">  [High Impact  3.6h  Yahoo]  Fiverr Jumps 10% After Revenue Beat and Upgraded Profit Outlook</w:t>
+        <w:t xml:space="preserve">  [High Impact  4.0h  Yahoo]  Fiverr Jumps 10% After Revenue Beat and Upgraded Profit Outlook</w:t>
       </w:r>
     </w:p>
     <w:p>
@@ -4778,7 +5574,7 @@
         <w:rPr>
           <w:sz w:val="17"/>
         </w:rPr>
-        <w:t xml:space="preserve">  [Low Impact  2.4h  Yahoo Finance]  Fiverr International (FVRR) Misses Q1 Earnings Estimates</w:t>
+        <w:t xml:space="preserve">  [Low Impact  2.8h  Yahoo Finance]  Fiverr International (FVRR) Misses Q1 Earnings Estimates</w:t>
       </w:r>
     </w:p>
     <w:p>
@@ -4789,7 +5585,7 @@
         <w:rPr>
           <w:sz w:val="17"/>
         </w:rPr>
-        <w:t xml:space="preserve">  [Low Impact  4.5h  Yahoo]  Fiverr (NYSE:FVRR) Surprises With Q1 CY2026 Sales, Stock Jumps 10%</w:t>
+        <w:t xml:space="preserve">  [Low Impact  4.9h  Yahoo]  Fiverr (NYSE:FVRR) Surprises With Q1 CY2026 Sales, Stock Jumps 10%</w:t>
       </w:r>
     </w:p>
     <w:p>
@@ -4800,7 +5596,7 @@
         <w:rPr>
           <w:sz w:val="17"/>
         </w:rPr>
-        <w:t xml:space="preserve">  [Low Impact  5.9h  Finnhub]  Fiverr International Ltd. Provides Earnings Guidance for the Second Quarter and Reiterates Guidance for Full Year 2026</w:t>
+        <w:t xml:space="preserve">  [Low Impact  5.9h  Benzinga]  12 Industrials Stocks Moving In Wednesday's Pre-Market Session</w:t>
       </w:r>
     </w:p>
     <w:p>
@@ -4811,7 +5607,7 @@
         <w:rPr>
           <w:sz w:val="17"/>
         </w:rPr>
-        <w:t xml:space="preserve">  [Low Impact  7.6h  Yahoo Finance]  Fiverr: Q1 Earnings Snapshot</w:t>
+        <w:t xml:space="preserve">  [Low Impact  6.4h  Finnhub]  Fiverr International Ltd. Provides Earnings Guidance for the Second Quarter and Reiterates Guidance for Full Year 2026</w:t>
       </w:r>
     </w:p>
     <w:p>
@@ -4822,7 +5618,7 @@
         <w:rPr>
           <w:sz w:val="17"/>
         </w:rPr>
-        <w:t xml:space="preserve">  [Low Impact  8.5h  Yahoo]  Fiverr Announces First Quarter 2026 Results</w:t>
+        <w:t xml:space="preserve">  [Low Impact  6.8h  Benzinga]  Earnings Scheduled For April 29, 2026</w:t>
       </w:r>
     </w:p>
     <w:p>
@@ -4841,26 +5637,7 @@
         <w:rPr>
           <w:sz w:val="17"/>
         </w:rPr>
-        <w:t xml:space="preserve">  [Low Impact  6.5h  Finnhub]  Sky Quarry Issues Request for Proposals to Accelerate Development of One Hundred Eighty Million Barrel PR Spring Oil Sands Asset Amid Tightening Western U.S. Fuel Supply</w:t>
-      </w:r>
-    </w:p>
-    <w:p>
-      <w:r>
-        <w:rPr>
-          <w:b/>
-        </w:rPr>
-        <w:t>GCTK  ·  GlucoTrack Inc</w:t>
-      </w:r>
-    </w:p>
-    <w:p>
-      <w:pPr>
-        <w:spacing w:after="20"/>
-      </w:pPr>
-      <w:r>
-        <w:rPr>
-          <w:sz w:val="17"/>
-        </w:rPr>
-        <w:t xml:space="preserve">  [Low Impact  1.0h  ChartMill]  Get insights into the top gainers and losers of Wednesday's pre-market session.</w:t>
+        <w:t xml:space="preserve">  [Low Impact  6.9h  Finnhub]  Sky Quarry Issues Request for Proposals to Accelerate Development of One Hundred Eighty Million Barrel PR Spring Oil Sands Asset Amid Tightening Western U.S. Fuel Supply</w:t>
       </w:r>
     </w:p>
     <w:p>
@@ -4879,7 +5656,7 @@
         <w:rPr>
           <w:sz w:val="17"/>
         </w:rPr>
-        <w:t xml:space="preserve">  [Low Impact  3.0h  Yahoo Finance]  Loss-Making Roadzen, Inc. (NASDAQ:RDZN) Expected To Breakeven In The Medium-Term</w:t>
+        <w:t xml:space="preserve">  [Low Impact  3.5h  Yahoo Finance]  Loss-Making Roadzen, Inc. (NASDAQ:RDZN) Expected To Breakeven In The Medium-Term</w:t>
       </w:r>
     </w:p>
     <w:p>
@@ -4890,7 +5667,7 @@
         <w:rPr>
           <w:sz w:val="17"/>
         </w:rPr>
-        <w:t xml:space="preserve">  [Low Impact  6.0h  Finnhub]  Roadzen’s drivebuddyAI Wins $2.5 Million Contract to Bring AI-Powered Safety to 3,000 Truck Fleet</w:t>
+        <w:t xml:space="preserve">  [Low Impact  6.5h  Finnhub]  Roadzen’s drivebuddyAI Wins $2.5 Million Contract to Bring AI-Powered Safety to 3,000 Truck Fleet</w:t>
       </w:r>
     </w:p>
     <w:p>
@@ -4901,7 +5678,7 @@
         <w:rPr>
           <w:sz w:val="17"/>
         </w:rPr>
-        <w:t xml:space="preserve">  [Low Impact  47.8h  Benzinga]  Roadzen shares are trading higher after the company announced a contract with an Indian insurer that's expected to generate over $10 million in annual revenue.</w:t>
+        <w:t xml:space="preserve">  [Low Impact  48.2h  Benzinga]  Roadzen shares are trading higher after the company announced a contract with an Indian insurer that's expected to generate over $10 million in annual revenue.</w:t>
       </w:r>
     </w:p>
     <w:p>
@@ -4912,7 +5689,7 @@
         <w:rPr>
           <w:sz w:val="17"/>
         </w:rPr>
-        <w:t xml:space="preserve">  [Low Impact  52.9h  Benzinga]  Roadzen Subsidiary VehicleCare Wins Contract With Unnamed India Insurer To Process Auto Insurance Claims, Expected To Generate $10M In Annual Revenue</w:t>
+        <w:t xml:space="preserve">  [Low Impact  53.3h  Benzinga]  Roadzen Subsidiary VehicleCare Wins Contract With Unnamed India Insurer To Process Auto Insurance Claims, Expected To Generate $10M In Annual Revenue</w:t>
       </w:r>
     </w:p>
     <w:p>
@@ -4923,7 +5700,7 @@
         <w:rPr>
           <w:sz w:val="17"/>
         </w:rPr>
-        <w:t xml:space="preserve">  [Low Impact  53.0h  Finnhub]  Roadzen’s VehicleCare Wins Major Claims Mandate from One of India’s Largest Insurers, Expected to Generate Over $10 Million in Annual Revenue</w:t>
+        <w:t xml:space="preserve">  [Low Impact  53.5h  Finnhub]  Roadzen’s VehicleCare Wins Major Claims Mandate from One of India’s Largest Insurers, Expected to Generate Over $10 Million in Annual Revenue</w:t>
       </w:r>
     </w:p>
     <w:p>
@@ -4931,7 +5708,7 @@
         <w:rPr>
           <w:b/>
         </w:rPr>
-        <w:t>WALD  ·  Waldencast plc</w:t>
+        <w:t>AGIO  ·  Agios Pharmaceuticals Inc</w:t>
       </w:r>
     </w:p>
     <w:p>
@@ -4942,7 +5719,7 @@
         <w:rPr>
           <w:sz w:val="17"/>
         </w:rPr>
-        <w:t xml:space="preserve">  [High Impact  19.0h  Finnhub]  Waldencast announces conclusion of SEC investigation</w:t>
+        <w:t xml:space="preserve">  [High Impact  2.6h  ChartMill]  Agios Pharmaceuticals (NASDAQ:AGIO) Q1 2026 Earnings Beat Drives Stock Rally</w:t>
       </w:r>
     </w:p>
     <w:p>
@@ -4953,7 +5730,7 @@
         <w:rPr>
           <w:sz w:val="17"/>
         </w:rPr>
-        <w:t xml:space="preserve">  [Low Impact  1.0h  ChartMill]  Get insights into the top gainers and losers of Wednesday's pre-market session.</w:t>
+        <w:t xml:space="preserve">  [Medium Impact  70.8h  Yahoo Finance]  BofA Reaffirms Buy Rating for Agios Pharmaceuticals (AGIO)</w:t>
       </w:r>
     </w:p>
     <w:p>
@@ -4964,7 +5741,7 @@
         <w:rPr>
           <w:sz w:val="17"/>
         </w:rPr>
-        <w:t xml:space="preserve">  [Low Impact  1.5h  Yahoo Finance]  Top Premarket Gainers</w:t>
+        <w:t xml:space="preserve">  [Low Impact  2.2h  Yahoo Finance]  Agios Pharmaceuticals (AGIO) Reports Q1 Loss, Tops Revenue Estimates</w:t>
       </w:r>
     </w:p>
     <w:p>
@@ -4975,7 +5752,29 @@
         <w:rPr>
           <w:sz w:val="17"/>
         </w:rPr>
-        <w:t xml:space="preserve">  [Low Impact  71.6h  Pypi.org]  prism-de added to PyPI</w:t>
+        <w:t xml:space="preserve">  [Low Impact  2.8h  Yahoo Finance]  Agios Pharmaceuticals Q1 Loss Widens, Revenue Increases</w:t>
+      </w:r>
+    </w:p>
+    <w:p>
+      <w:pPr>
+        <w:spacing w:after="20"/>
+      </w:pPr>
+      <w:r>
+        <w:rPr>
+          <w:sz w:val="17"/>
+        </w:rPr>
+        <w:t xml:space="preserve">  [Low Impact  3.3h  Yahoo Finance]  Agios Pharmaceuticals: Q1 Earnings Snapshot</w:t>
+      </w:r>
+    </w:p>
+    <w:p>
+      <w:pPr>
+        <w:spacing w:after="20"/>
+      </w:pPr>
+      <w:r>
+        <w:rPr>
+          <w:sz w:val="17"/>
+        </w:rPr>
+        <w:t xml:space="preserve">  [Low Impact  5.1h  Finnhub]  Agios Pharmaceuticals, Inc. Reports Earnings Results for the First Quarter Ended March 31, 2026</w:t>
       </w:r>
     </w:p>
     <w:p>
@@ -4994,7 +5793,7 @@
         <w:rPr>
           <w:sz w:val="17"/>
         </w:rPr>
-        <w:t xml:space="preserve">  [Low Impact  1.0h  ChartMill]  Get insights into the top gainers and losers of Wednesday's pre-market session.</w:t>
+        <w:t xml:space="preserve">  [Low Impact  1.5h  ChartMill]  Get insights into the top gainers and losers of Wednesday's pre-market session.</w:t>
       </w:r>
     </w:p>
     <w:p>
@@ -5005,7 +5804,7 @@
         <w:rPr>
           <w:sz w:val="17"/>
         </w:rPr>
-        <w:t xml:space="preserve">  [Low Impact  1.0h  Yahoo Finance]  Akanda Adjourns Special Meeting of Shareholders</w:t>
+        <w:t xml:space="preserve">  [Low Impact  1.5h  Yahoo Finance]  Akanda Adjourns Special Meeting of Shareholders</w:t>
       </w:r>
     </w:p>
     <w:p>
@@ -5016,7 +5815,7 @@
         <w:rPr>
           <w:sz w:val="17"/>
         </w:rPr>
-        <w:t xml:space="preserve">  [Low Impact  1.5h  Yahoo Finance]  Top Premarket Gainers</w:t>
+        <w:t xml:space="preserve">  [Low Impact  1.9h  Yahoo Finance]  Top Premarket Gainers</w:t>
       </w:r>
     </w:p>
     <w:p>
@@ -5027,7 +5826,7 @@
         <w:rPr>
           <w:sz w:val="17"/>
         </w:rPr>
-        <w:t xml:space="preserve">  [Low Impact  18.5h  ChartMill]  Here are the top movers in Tuesday's session.</w:t>
+        <w:t xml:space="preserve">  [Low Impact  5.9h  Benzinga]  12 Health Care Stocks Moving In Wednesday's Pre-Market Session</w:t>
       </w:r>
     </w:p>
     <w:p>
@@ -5038,7 +5837,7 @@
         <w:rPr>
           <w:sz w:val="17"/>
         </w:rPr>
-        <w:t xml:space="preserve">  [Low Impact  20.4h  Benzinga]  12 Health Care Stocks Moving In Tuesday's After-Market Session</w:t>
+        <w:t xml:space="preserve">  [Low Impact  19.0h  ChartMill]  Here are the top movers in Tuesday's session.</w:t>
       </w:r>
     </w:p>
     <w:p>
@@ -5049,7 +5848,7 @@
         <w:rPr>
           <w:sz w:val="17"/>
         </w:rPr>
-        <w:t xml:space="preserve">  [Low Impact  24.4h  Benzinga]  12 Health Care Stocks Moving In Tuesday's Intraday Session</w:t>
+        <w:t xml:space="preserve">  [Low Impact  20.9h  Benzinga]  12 Health Care Stocks Moving In Tuesday's After-Market Session</w:t>
       </w:r>
     </w:p>
     <w:p>
@@ -5068,7 +5867,7 @@
         <w:rPr>
           <w:sz w:val="17"/>
         </w:rPr>
-        <w:t xml:space="preserve">  [High Impact  6.5h  Finnhub]  OppFi Announces Definitive Agreement to Acquire BNCCORP, Inc. and BNC National Bank and the Elimination of Up-C Structure</w:t>
+        <w:t xml:space="preserve">  [High Impact  6.9h  Finnhub]  OppFi Announces Definitive Agreement to Acquire BNCCORP, Inc. and BNC National Bank and the Elimination of Up-C Structure</w:t>
       </w:r>
     </w:p>
     <w:p>
@@ -5079,7 +5878,7 @@
         <w:rPr>
           <w:sz w:val="17"/>
         </w:rPr>
-        <w:t xml:space="preserve">  [Low Impact  2.5h  Yahoo Finance]  BNCCORP To Be Acquired By OppFi in Transformative Customer-Focused Transaction</w:t>
+        <w:t xml:space="preserve">  [Low Impact  3.0h  Yahoo Finance]  BNCCORP To Be Acquired By OppFi in Transformative Customer-Focused Transaction</w:t>
       </w:r>
     </w:p>
     <w:p>
@@ -5090,7 +5889,48 @@
         <w:rPr>
           <w:sz w:val="17"/>
         </w:rPr>
-        <w:t xml:space="preserve">  [Low Impact  59.6h  SeekingAlpha]  OppFi: Cheap For The Risk Tolerant, Maintain Hold</w:t>
+        <w:t xml:space="preserve">  [Low Impact  4.1h  Finnhub]  OppFi : acquires BNC Bank</w:t>
+      </w:r>
+    </w:p>
+    <w:p>
+      <w:pPr>
+        <w:spacing w:after="20"/>
+      </w:pPr>
+      <w:r>
+        <w:rPr>
+          <w:sz w:val="17"/>
+        </w:rPr>
+        <w:t xml:space="preserve">  [Low Impact  60.0h  SeekingAlpha]  OppFi: Cheap For The Risk Tolerant, Maintain Hold</w:t>
+      </w:r>
+    </w:p>
+    <w:p>
+      <w:r>
+        <w:rPr>
+          <w:b/>
+        </w:rPr>
+        <w:t>CRBP  ·  Corbus Pharmaceuticals Holdings Inc</w:t>
+      </w:r>
+    </w:p>
+    <w:p>
+      <w:pPr>
+        <w:spacing w:after="20"/>
+      </w:pPr>
+      <w:r>
+        <w:rPr>
+          <w:sz w:val="17"/>
+        </w:rPr>
+        <w:t xml:space="preserve">  [Medium Impact  0.3h  Yahoo Finance]  Spotify upgraded, Alibaba initiated: Wall Street's top analyst calls</w:t>
+      </w:r>
+    </w:p>
+    <w:p>
+      <w:pPr>
+        <w:spacing w:after="20"/>
+      </w:pPr>
+      <w:r>
+        <w:rPr>
+          <w:sz w:val="17"/>
+        </w:rPr>
+        <w:t xml:space="preserve">  [Low Impact  2.6h  Yahoo Finance]  Guggenheim Initiates Corbus Pharmaceuticals at Buy With $45 Price Target</w:t>
       </w:r>
     </w:p>
     <w:p>
@@ -5109,7 +5949,7 @@
         <w:rPr>
           <w:sz w:val="17"/>
         </w:rPr>
-        <w:t xml:space="preserve">  [Low Impact  5.5h  Finnhub]  Fully Booked Momentus Mission Advances Through Preliminary Design Review, Driving Toward 2027 Launch Under NASA Contracts</w:t>
+        <w:t xml:space="preserve">  [Low Impact  5.9h  Finnhub]  Fully Booked Momentus Mission Advances Through Preliminary Design Review, Driving Toward 2027 Launch Under NASA Contracts</w:t>
       </w:r>
     </w:p>
     <w:p>
@@ -5120,7 +5960,48 @@
         <w:rPr>
           <w:sz w:val="17"/>
         </w:rPr>
-        <w:t xml:space="preserve">  [Low Impact  24.4h  Benzinga]  12 Industrials Stocks Moving In Tuesday's Intraday Session</w:t>
+        <w:t xml:space="preserve">  [Low Impact  24.9h  Benzinga]  12 Industrials Stocks Moving In Tuesday's Intraday Session</w:t>
+      </w:r>
+    </w:p>
+    <w:p>
+      <w:r>
+        <w:rPr>
+          <w:b/>
+        </w:rPr>
+        <w:t>NBP  ·  NovaBridge Biosciences ADR</w:t>
+      </w:r>
+    </w:p>
+    <w:p>
+      <w:pPr>
+        <w:spacing w:after="20"/>
+      </w:pPr>
+      <w:r>
+        <w:rPr>
+          <w:sz w:val="17"/>
+        </w:rPr>
+        <w:t xml:space="preserve">  [Low Impact  1.1h  Yahoo Finance]  Daily – Vickers Top Buyers &amp; Sellers for 04/29/2026</w:t>
+      </w:r>
+    </w:p>
+    <w:p>
+      <w:pPr>
+        <w:spacing w:after="20"/>
+      </w:pPr>
+      <w:r>
+        <w:rPr>
+          <w:sz w:val="17"/>
+        </w:rPr>
+        <w:t xml:space="preserve">  [Low Impact  17.0h  ChartMill]  Get insights into the top gainers and losers of Tuesday's after-hours session.</w:t>
+      </w:r>
+    </w:p>
+    <w:p>
+      <w:pPr>
+        <w:spacing w:after="20"/>
+      </w:pPr>
+      <w:r>
+        <w:rPr>
+          <w:sz w:val="17"/>
+        </w:rPr>
+        <w:t xml:space="preserve">  [Low Impact  20.9h  Benzinga]  12 Health Care Stocks Moving In Tuesday's After-Market Session</w:t>
       </w:r>
     </w:p>
     <w:p>
@@ -5139,48 +6020,7 @@
         <w:rPr>
           <w:sz w:val="17"/>
         </w:rPr>
-        <w:t xml:space="preserve">  [Low Impact  19.4h  Yahoo Finance]  Pioneer Power Solutions And 2 Other Penny Stocks Worth Watching</w:t>
-      </w:r>
-    </w:p>
-    <w:p>
-      <w:r>
-        <w:rPr>
-          <w:b/>
-        </w:rPr>
-        <w:t>NBP  ·  NovaBridge Biosciences ADR</w:t>
-      </w:r>
-    </w:p>
-    <w:p>
-      <w:pPr>
-        <w:spacing w:after="20"/>
-      </w:pPr>
-      <w:r>
-        <w:rPr>
-          <w:sz w:val="17"/>
-        </w:rPr>
-        <w:t xml:space="preserve">  [Low Impact  16.5h  ChartMill]  Get insights into the top gainers and losers of Tuesday's after-hours session.</w:t>
-      </w:r>
-    </w:p>
-    <w:p>
-      <w:pPr>
-        <w:spacing w:after="20"/>
-      </w:pPr>
-      <w:r>
-        <w:rPr>
-          <w:sz w:val="17"/>
-        </w:rPr>
-        <w:t xml:space="preserve">  [Low Impact  20.4h  Benzinga]  12 Health Care Stocks Moving In Tuesday's After-Market Session</w:t>
-      </w:r>
-    </w:p>
-    <w:p>
-      <w:pPr>
-        <w:spacing w:after="20"/>
-      </w:pPr>
-      <w:r>
-        <w:rPr>
-          <w:sz w:val="17"/>
-        </w:rPr>
-        <w:t xml:space="preserve">  [Low Impact  62.5h  Royal Society of Chemistry]  Synergistic and autocatalytic proton shuttle with a bifunctional solid acid in low-toxic molten salt hydrate for efficient levulinic acid production from cellulose</w:t>
+        <w:t xml:space="preserve">  [Low Impact  19.9h  Yahoo Finance]  Pioneer Power Solutions And 2 Other Penny Stocks Worth Watching</w:t>
       </w:r>
     </w:p>
     <w:p>
@@ -5195,7 +6035,7 @@
     </w:p>
     <w:p>
       <w:r>
-        <w:t>GO-tier symbols:  SAGT  FCEL  PRCH  KALV</w:t>
+        <w:t>GO-tier symbols:  SAGT  FCEL  TRAW  PRCH  KALV</w:t>
       </w:r>
     </w:p>
     <w:p>

</xml_diff>